<commit_message>
Update KWL chart docx with latest revision
Last Modified By set to Lanzi Wang on the newly edited file.

Co-Authored-By: Claude Fable 5.1 <noreply@anthropic.com>
Claude-Session: https://claude.ai/code/session_018Wwvf191kmGDopJFvmCyqN
</commit_message>
<xml_diff>
--- a/output/Unit_1_-_KWL_Chart.docx
+++ b/output/Unit_1_-_KWL_Chart.docx
@@ -821,153 +821,6 @@
               <w:right w:w="100" w:type="dxa"/>
             </w:tcMar>
           </w:tcPr>
-          <w:p>
-            <w:pPr>
-              <w:widowControl w:val="0"/>
-              <w:numPr>
-                <w:ilvl w:val="0"/>
-                <w:numId w:val="4"/>
-              </w:numPr>
-              <w:pBdr>
-                <w:top w:val="nil"/>
-                <w:left w:val="nil"/>
-                <w:bottom w:val="nil"/>
-                <w:right w:val="nil"/>
-                <w:between w:val="nil"/>
-              </w:pBdr>
-              <w:rPr>
-                <w:rFonts w:ascii="Lato" w:eastAsia="Lato" w:hAnsi="Lato" w:cs="Lato"/>
-              </w:rPr>
-            </w:pPr>
-            <w:r>
-              <w:rPr>
-                <w:rFonts w:ascii="Lato" w:eastAsia="Lato" w:hAnsi="Lato" w:cs="Lato"/>
-              </w:rPr>
-              <w:t>you can add, subtract, multiply and divide functions</w:t>
-            </w:r>
-          </w:p>
-          <w:p>
-            <w:pPr>
-              <w:widowControl w:val="0"/>
-              <w:numPr>
-                <w:ilvl w:val="0"/>
-                <w:numId w:val="4"/>
-              </w:numPr>
-              <w:pBdr>
-                <w:top w:val="nil"/>
-                <w:left w:val="nil"/>
-                <w:bottom w:val="nil"/>
-                <w:right w:val="nil"/>
-                <w:between w:val="nil"/>
-              </w:pBdr>
-              <w:rPr>
-                <w:rFonts w:ascii="Lato" w:eastAsia="Lato" w:hAnsi="Lato" w:cs="Lato"/>
-              </w:rPr>
-            </w:pPr>
-            <w:r>
-              <w:rPr>
-                <w:rFonts w:ascii="Lato" w:eastAsia="Lato" w:hAnsi="Lato" w:cs="Lato"/>
-              </w:rPr>
-              <w:t>composite functions are when you put one function inside another, like f(g(x))</w:t>
-            </w:r>
-          </w:p>
-          <w:p>
-            <w:pPr>
-              <w:widowControl w:val="0"/>
-              <w:numPr>
-                <w:ilvl w:val="0"/>
-                <w:numId w:val="4"/>
-              </w:numPr>
-              <w:pBdr>
-                <w:top w:val="nil"/>
-                <w:left w:val="nil"/>
-                <w:bottom w:val="nil"/>
-                <w:right w:val="nil"/>
-                <w:between w:val="nil"/>
-              </w:pBdr>
-              <w:rPr>
-                <w:rFonts w:ascii="Lato" w:eastAsia="Lato" w:hAnsi="Lato" w:cs="Lato"/>
-              </w:rPr>
-            </w:pPr>
-            <w:r>
-              <w:rPr>
-                <w:rFonts w:ascii="Lato" w:eastAsia="Lato" w:hAnsi="Lato" w:cs="Lato"/>
-              </w:rPr>
-              <w:t>average rate of change is the slope between 2 points</w:t>
-            </w:r>
-          </w:p>
-          <w:p>
-            <w:pPr>
-              <w:widowControl w:val="0"/>
-              <w:numPr>
-                <w:ilvl w:val="0"/>
-                <w:numId w:val="4"/>
-              </w:numPr>
-              <w:pBdr>
-                <w:top w:val="nil"/>
-                <w:left w:val="nil"/>
-                <w:bottom w:val="nil"/>
-                <w:right w:val="nil"/>
-                <w:between w:val="nil"/>
-              </w:pBdr>
-              <w:rPr>
-                <w:rFonts w:ascii="Lato" w:eastAsia="Lato" w:hAnsi="Lato" w:cs="Lato"/>
-              </w:rPr>
-            </w:pPr>
-            <w:r>
-              <w:rPr>
-                <w:rFonts w:ascii="Lato" w:eastAsia="Lato" w:hAnsi="Lato" w:cs="Lato"/>
-              </w:rPr>
-              <w:t>instantaneous rate of change is the slope at just one point</w:t>
-            </w:r>
-          </w:p>
-          <w:p>
-            <w:pPr>
-              <w:widowControl w:val="0"/>
-              <w:numPr>
-                <w:ilvl w:val="0"/>
-                <w:numId w:val="4"/>
-              </w:numPr>
-              <w:pBdr>
-                <w:top w:val="nil"/>
-                <w:left w:val="nil"/>
-                <w:bottom w:val="nil"/>
-                <w:right w:val="nil"/>
-                <w:between w:val="nil"/>
-              </w:pBdr>
-              <w:rPr>
-                <w:rFonts w:ascii="Lato" w:eastAsia="Lato" w:hAnsi="Lato" w:cs="Lato"/>
-              </w:rPr>
-            </w:pPr>
-            <w:proofErr w:type="gramStart"/>
-            <w:r>
-              <w:rPr>
-                <w:rFonts w:ascii="Lato" w:eastAsia="Lato" w:hAnsi="Lato" w:cs="Lato"/>
-              </w:rPr>
-              <w:t>you</w:t>
-            </w:r>
-            <w:proofErr w:type="gramEnd"/>
-            <w:r>
-              <w:rPr>
-                <w:rFonts w:ascii="Lato" w:eastAsia="Lato" w:hAnsi="Lato" w:cs="Lato"/>
-              </w:rPr>
-              <w:t xml:space="preserve"> can use points </w:t>
-            </w:r>
-            <w:proofErr w:type="gramStart"/>
-            <w:r>
-              <w:rPr>
-                <w:rFonts w:ascii="Lato" w:eastAsia="Lato" w:hAnsi="Lato" w:cs="Lato"/>
-              </w:rPr>
-              <w:t>really close</w:t>
-            </w:r>
-            <w:proofErr w:type="gramEnd"/>
-            <w:r>
-              <w:rPr>
-                <w:rFonts w:ascii="Lato" w:eastAsia="Lato" w:hAnsi="Lato" w:cs="Lato"/>
-              </w:rPr>
-              <w:t xml:space="preserve"> together to estimate it</w:t>
-            </w:r>
-          </w:p>
           <w:p>
             <w:pPr>
               <w:widowControl w:val="0"/>
@@ -2245,6 +2098,7 @@
   <w:style w:type="character" w:default="1" w:styleId="DefaultParagraphFont">
     <w:name w:val="Default Paragraph Font"/>
     <w:uiPriority w:val="1"/>
+    <w:semiHidden/>
     <w:unhideWhenUsed/>
   </w:style>
   <w:style w:type="table" w:default="1" w:styleId="TableNormal">

</xml_diff>